<commit_message>
add link to svg
</commit_message>
<xml_diff>
--- a/docs/Документация.docx
+++ b/docs/Документация.docx
@@ -2637,7 +2637,16 @@
           <w:sz w:val="28"/>
           <w:szCs w:val="28"/>
         </w:rPr>
-        <w:t>Для фронтенд</w:t>
+        <w:t xml:space="preserve">Для </w:t>
+      </w:r>
+      <w:proofErr w:type="spellStart"/>
+      <w:r>
+        <w:rPr>
+          <w:rFonts w:ascii="Times New Roman" w:hAnsi="Times New Roman" w:cs="Times New Roman"/>
+          <w:sz w:val="28"/>
+          <w:szCs w:val="28"/>
+        </w:rPr>
+        <w:t>фронтенд</w:t>
       </w:r>
       <w:r>
         <w:rPr>
@@ -2647,6 +2656,7 @@
         </w:rPr>
         <w:t>а</w:t>
       </w:r>
+      <w:proofErr w:type="spellEnd"/>
       <w:r>
         <w:rPr>
           <w:rFonts w:ascii="Times New Roman" w:hAnsi="Times New Roman" w:cs="Times New Roman"/>
@@ -2671,13 +2681,23 @@
         </w:rPr>
         <w:t xml:space="preserve">JavaScript, что позволяет создавать интерактивные и адаптивные пользовательские интерфейсы. HTML обеспечивает структуру веб-страниц, CSS отвечает за стилизацию и оформление, а JavaScript добавляет динамичность и интерактивность. Эти технологии являются стандартом в веб-разработке </w:t>
       </w:r>
-      <w:r>
-        <w:rPr>
-          <w:rFonts w:ascii="Times New Roman" w:hAnsi="Times New Roman" w:cs="Times New Roman"/>
-          <w:sz w:val="28"/>
-          <w:szCs w:val="28"/>
-        </w:rPr>
-        <w:t>и в связи с этим обладают хорошей документированность</w:t>
+      <w:proofErr w:type="gramStart"/>
+      <w:r>
+        <w:rPr>
+          <w:rFonts w:ascii="Times New Roman" w:hAnsi="Times New Roman" w:cs="Times New Roman"/>
+          <w:sz w:val="28"/>
+          <w:szCs w:val="28"/>
+        </w:rPr>
+        <w:t>и</w:t>
+      </w:r>
+      <w:proofErr w:type="gramEnd"/>
+      <w:r>
+        <w:rPr>
+          <w:rFonts w:ascii="Times New Roman" w:hAnsi="Times New Roman" w:cs="Times New Roman"/>
+          <w:sz w:val="28"/>
+          <w:szCs w:val="28"/>
+        </w:rPr>
+        <w:t xml:space="preserve"> в связи с этим обладают хорошей документированность</w:t>
       </w:r>
       <w:r>
         <w:rPr>
@@ -2714,7 +2734,25 @@
           <w:sz w:val="28"/>
           <w:szCs w:val="28"/>
         </w:rPr>
-        <w:t xml:space="preserve">Для ускорения разработки и создания адаптивного дизайна мы решили использовать фреймворк Bootstrap. Он предоставляет </w:t>
+        <w:t xml:space="preserve">Для ускорения разработки и создания адаптивного дизайна мы решили использовать фреймворк </w:t>
+      </w:r>
+      <w:proofErr w:type="spellStart"/>
+      <w:r>
+        <w:rPr>
+          <w:rFonts w:ascii="Times New Roman" w:hAnsi="Times New Roman" w:cs="Times New Roman"/>
+          <w:sz w:val="28"/>
+          <w:szCs w:val="28"/>
+        </w:rPr>
+        <w:t>Bootstrap</w:t>
+      </w:r>
+      <w:proofErr w:type="spellEnd"/>
+      <w:r>
+        <w:rPr>
+          <w:rFonts w:ascii="Times New Roman" w:hAnsi="Times New Roman" w:cs="Times New Roman"/>
+          <w:sz w:val="28"/>
+          <w:szCs w:val="28"/>
+        </w:rPr>
+        <w:t xml:space="preserve">. Он предоставляет </w:t>
       </w:r>
       <w:r>
         <w:rPr>
@@ -2991,7 +3029,25 @@
           <w:sz w:val="28"/>
           <w:szCs w:val="28"/>
         </w:rPr>
-        <w:t>Для управления версиями и совместной работы над проектом используется Git, который позволяет отслеживать изменения в коде и эффективно управлять совместной разработкой.</w:t>
+        <w:t xml:space="preserve">Для управления версиями и совместной работы над проектом используется </w:t>
+      </w:r>
+      <w:proofErr w:type="spellStart"/>
+      <w:r>
+        <w:rPr>
+          <w:rFonts w:ascii="Times New Roman" w:hAnsi="Times New Roman" w:cs="Times New Roman"/>
+          <w:sz w:val="28"/>
+          <w:szCs w:val="28"/>
+        </w:rPr>
+        <w:t>Git</w:t>
+      </w:r>
+      <w:proofErr w:type="spellEnd"/>
+      <w:r>
+        <w:rPr>
+          <w:rFonts w:ascii="Times New Roman" w:hAnsi="Times New Roman" w:cs="Times New Roman"/>
+          <w:sz w:val="28"/>
+          <w:szCs w:val="28"/>
+        </w:rPr>
+        <w:t>, который позволяет отслеживать изменения в коде и эффективно управлять совместной разработкой.</w:t>
       </w:r>
       <w:r>
         <w:rPr>
@@ -3017,6 +3073,7 @@
         </w:rPr>
         <w:t xml:space="preserve"> удаленного репозитория использовался </w:t>
       </w:r>
+      <w:proofErr w:type="spellStart"/>
       <w:r>
         <w:rPr>
           <w:rFonts w:ascii="Times New Roman" w:hAnsi="Times New Roman" w:cs="Times New Roman"/>
@@ -3026,6 +3083,7 @@
         </w:rPr>
         <w:t>Github</w:t>
       </w:r>
+      <w:proofErr w:type="spellEnd"/>
       <w:r>
         <w:rPr>
           <w:rFonts w:ascii="Times New Roman" w:hAnsi="Times New Roman" w:cs="Times New Roman"/>
@@ -3053,7 +3111,61 @@
           <w:sz w:val="28"/>
           <w:szCs w:val="28"/>
         </w:rPr>
-        <w:t>Кроме того, мы применяем Docker и Docker Compose для упрощения развертывания и управления зависимостями нашего веб-приложения. Эти инструменты позволяют описывать и запускать приложения, что делает процесс развертывания более</w:t>
+        <w:t xml:space="preserve">Кроме того, мы применяем </w:t>
+      </w:r>
+      <w:proofErr w:type="spellStart"/>
+      <w:r>
+        <w:rPr>
+          <w:rFonts w:ascii="Times New Roman" w:hAnsi="Times New Roman" w:cs="Times New Roman"/>
+          <w:sz w:val="28"/>
+          <w:szCs w:val="28"/>
+        </w:rPr>
+        <w:t>Docker</w:t>
+      </w:r>
+      <w:proofErr w:type="spellEnd"/>
+      <w:r>
+        <w:rPr>
+          <w:rFonts w:ascii="Times New Roman" w:hAnsi="Times New Roman" w:cs="Times New Roman"/>
+          <w:sz w:val="28"/>
+          <w:szCs w:val="28"/>
+        </w:rPr>
+        <w:t xml:space="preserve"> и </w:t>
+      </w:r>
+      <w:proofErr w:type="spellStart"/>
+      <w:r>
+        <w:rPr>
+          <w:rFonts w:ascii="Times New Roman" w:hAnsi="Times New Roman" w:cs="Times New Roman"/>
+          <w:sz w:val="28"/>
+          <w:szCs w:val="28"/>
+        </w:rPr>
+        <w:t>Docker</w:t>
+      </w:r>
+      <w:proofErr w:type="spellEnd"/>
+      <w:r>
+        <w:rPr>
+          <w:rFonts w:ascii="Times New Roman" w:hAnsi="Times New Roman" w:cs="Times New Roman"/>
+          <w:sz w:val="28"/>
+          <w:szCs w:val="28"/>
+        </w:rPr>
+        <w:t xml:space="preserve"> </w:t>
+      </w:r>
+      <w:proofErr w:type="spellStart"/>
+      <w:r>
+        <w:rPr>
+          <w:rFonts w:ascii="Times New Roman" w:hAnsi="Times New Roman" w:cs="Times New Roman"/>
+          <w:sz w:val="28"/>
+          <w:szCs w:val="28"/>
+        </w:rPr>
+        <w:t>Compose</w:t>
+      </w:r>
+      <w:proofErr w:type="spellEnd"/>
+      <w:r>
+        <w:rPr>
+          <w:rFonts w:ascii="Times New Roman" w:hAnsi="Times New Roman" w:cs="Times New Roman"/>
+          <w:sz w:val="28"/>
+          <w:szCs w:val="28"/>
+        </w:rPr>
+        <w:t xml:space="preserve"> для упрощения развертывания и управления зависимостями нашего веб-приложения. Эти инструменты позволяют описывать и запускать приложения, что делает процесс развертывания более</w:t>
       </w:r>
       <w:r>
         <w:rPr>
@@ -3325,6 +3437,7 @@
         </w:rPr>
         <w:t>Основа (</w:t>
       </w:r>
+      <w:proofErr w:type="spellStart"/>
       <w:r>
         <w:rPr>
           <w:rFonts w:ascii="Times New Roman" w:hAnsi="Times New Roman" w:cs="Times New Roman"/>
@@ -3332,7 +3445,17 @@
           <w:szCs w:val="28"/>
           <w:lang w:val="en-US"/>
         </w:rPr>
-        <w:t>food_control)</w:t>
+        <w:t>food_control</w:t>
+      </w:r>
+      <w:proofErr w:type="spellEnd"/>
+      <w:r>
+        <w:rPr>
+          <w:rFonts w:ascii="Times New Roman" w:hAnsi="Times New Roman" w:cs="Times New Roman"/>
+          <w:sz w:val="28"/>
+          <w:szCs w:val="28"/>
+          <w:lang w:val="en-US"/>
+        </w:rPr>
+        <w:t>)</w:t>
       </w:r>
     </w:p>
     <w:p>
@@ -3806,13 +3929,23 @@
           <w:szCs w:val="28"/>
         </w:rPr>
       </w:pPr>
-      <w:r>
-        <w:rPr>
-          <w:rFonts w:ascii="Times New Roman" w:hAnsi="Times New Roman" w:cs="Times New Roman"/>
-          <w:sz w:val="28"/>
-          <w:szCs w:val="28"/>
-        </w:rPr>
-        <w:t>Фикстуры (</w:t>
+      <w:proofErr w:type="spellStart"/>
+      <w:r>
+        <w:rPr>
+          <w:rFonts w:ascii="Times New Roman" w:hAnsi="Times New Roman" w:cs="Times New Roman"/>
+          <w:sz w:val="28"/>
+          <w:szCs w:val="28"/>
+        </w:rPr>
+        <w:t>Фикстуры</w:t>
+      </w:r>
+      <w:proofErr w:type="spellEnd"/>
+      <w:r>
+        <w:rPr>
+          <w:rFonts w:ascii="Times New Roman" w:hAnsi="Times New Roman" w:cs="Times New Roman"/>
+          <w:sz w:val="28"/>
+          <w:szCs w:val="28"/>
+        </w:rPr>
+        <w:t xml:space="preserve"> (</w:t>
       </w:r>
       <w:r>
         <w:rPr>
@@ -4755,7 +4888,43 @@
           <w:sz w:val="28"/>
           <w:szCs w:val="28"/>
         </w:rPr>
-        <w:t>Для хранения данных в нашем веб-приложении, предназначенном для управления школьной столовой, была выбрана система управления базами данных PostgreSQL. Данный выбор обусловлен рядом важных характеристик, которые делают PostgreSQL оптимальным решением для нашего проекта.</w:t>
+        <w:t xml:space="preserve">Для хранения данных в нашем веб-приложении, предназначенном для управления школьной столовой, была выбрана система управления базами данных </w:t>
+      </w:r>
+      <w:proofErr w:type="spellStart"/>
+      <w:r>
+        <w:rPr>
+          <w:rFonts w:ascii="Times New Roman" w:eastAsia="Times New Roman" w:hAnsi="Times New Roman" w:cs="Times New Roman"/>
+          <w:sz w:val="28"/>
+          <w:szCs w:val="28"/>
+        </w:rPr>
+        <w:t>PostgreSQL</w:t>
+      </w:r>
+      <w:proofErr w:type="spellEnd"/>
+      <w:r>
+        <w:rPr>
+          <w:rFonts w:ascii="Times New Roman" w:eastAsia="Times New Roman" w:hAnsi="Times New Roman" w:cs="Times New Roman"/>
+          <w:sz w:val="28"/>
+          <w:szCs w:val="28"/>
+        </w:rPr>
+        <w:t xml:space="preserve">. Данный выбор обусловлен рядом важных характеристик, которые делают </w:t>
+      </w:r>
+      <w:proofErr w:type="spellStart"/>
+      <w:r>
+        <w:rPr>
+          <w:rFonts w:ascii="Times New Roman" w:eastAsia="Times New Roman" w:hAnsi="Times New Roman" w:cs="Times New Roman"/>
+          <w:sz w:val="28"/>
+          <w:szCs w:val="28"/>
+        </w:rPr>
+        <w:t>PostgreSQL</w:t>
+      </w:r>
+      <w:proofErr w:type="spellEnd"/>
+      <w:r>
+        <w:rPr>
+          <w:rFonts w:ascii="Times New Roman" w:eastAsia="Times New Roman" w:hAnsi="Times New Roman" w:cs="Times New Roman"/>
+          <w:sz w:val="28"/>
+          <w:szCs w:val="28"/>
+        </w:rPr>
+        <w:t xml:space="preserve"> оптимальным решением для нашего проекта.</w:t>
       </w:r>
     </w:p>
     <w:p>
@@ -4775,7 +4944,43 @@
           <w:sz w:val="28"/>
           <w:szCs w:val="28"/>
         </w:rPr>
-        <w:t>Во-первых, PostgreSQL является мощной и надежной серверной СУБД, способной эффективно работать с большим количеством данных и одновременных пользователей. Поскольку система школьной столовой предполагает хранение информации о пользователях, меню, оплатах, заявках на закупку и отчетах, использование PostgreSQL позволяет обеспечить стабильную работу приложения даже при росте нагрузки. Это особенно важно для школьной инфраструктуры, где требуется высокая надежность и целостность данных.</w:t>
+        <w:t xml:space="preserve">Во-первых, </w:t>
+      </w:r>
+      <w:proofErr w:type="spellStart"/>
+      <w:r>
+        <w:rPr>
+          <w:rFonts w:ascii="Times New Roman" w:eastAsia="Times New Roman" w:hAnsi="Times New Roman" w:cs="Times New Roman"/>
+          <w:sz w:val="28"/>
+          <w:szCs w:val="28"/>
+        </w:rPr>
+        <w:t>PostgreSQL</w:t>
+      </w:r>
+      <w:proofErr w:type="spellEnd"/>
+      <w:r>
+        <w:rPr>
+          <w:rFonts w:ascii="Times New Roman" w:eastAsia="Times New Roman" w:hAnsi="Times New Roman" w:cs="Times New Roman"/>
+          <w:sz w:val="28"/>
+          <w:szCs w:val="28"/>
+        </w:rPr>
+        <w:t xml:space="preserve"> является мощной и надежной серверной СУБД, способной эффективно работать с большим количеством данных и одновременных пользователей. Поскольку система школьной столовой предполагает хранение информации о пользователях, меню, оплатах, заявках на закупку и отчетах, использование </w:t>
+      </w:r>
+      <w:proofErr w:type="spellStart"/>
+      <w:r>
+        <w:rPr>
+          <w:rFonts w:ascii="Times New Roman" w:eastAsia="Times New Roman" w:hAnsi="Times New Roman" w:cs="Times New Roman"/>
+          <w:sz w:val="28"/>
+          <w:szCs w:val="28"/>
+        </w:rPr>
+        <w:t>PostgreSQL</w:t>
+      </w:r>
+      <w:proofErr w:type="spellEnd"/>
+      <w:r>
+        <w:rPr>
+          <w:rFonts w:ascii="Times New Roman" w:eastAsia="Times New Roman" w:hAnsi="Times New Roman" w:cs="Times New Roman"/>
+          <w:sz w:val="28"/>
+          <w:szCs w:val="28"/>
+        </w:rPr>
+        <w:t xml:space="preserve"> позволяет обеспечить стабильную работу приложения даже при росте нагрузки. Это особенно важно для школьной инфраструктуры, где требуется высокая надежность и целостность данных.</w:t>
       </w:r>
     </w:p>
     <w:p>
@@ -4795,7 +5000,25 @@
           <w:sz w:val="28"/>
           <w:szCs w:val="28"/>
         </w:rPr>
-        <w:t>Во-вторых, PostgreSQL поддерживает полноценную клиент-серверную архитектуру, что позволяет гибко управлять доступом к данным и повышает уровень безопасности. Это является значительным преимуществом при работе с персональными данными учащихся и финансовой информацией, связанной с оплатой питания.</w:t>
+        <w:t xml:space="preserve">Во-вторых, </w:t>
+      </w:r>
+      <w:proofErr w:type="spellStart"/>
+      <w:r>
+        <w:rPr>
+          <w:rFonts w:ascii="Times New Roman" w:eastAsia="Times New Roman" w:hAnsi="Times New Roman" w:cs="Times New Roman"/>
+          <w:sz w:val="28"/>
+          <w:szCs w:val="28"/>
+        </w:rPr>
+        <w:t>PostgreSQL</w:t>
+      </w:r>
+      <w:proofErr w:type="spellEnd"/>
+      <w:r>
+        <w:rPr>
+          <w:rFonts w:ascii="Times New Roman" w:eastAsia="Times New Roman" w:hAnsi="Times New Roman" w:cs="Times New Roman"/>
+          <w:sz w:val="28"/>
+          <w:szCs w:val="28"/>
+        </w:rPr>
+        <w:t xml:space="preserve"> поддерживает полноценную клиент-серверную архитектуру, что позволяет гибко управлять доступом к данным и повышает уровень безопасности. Это является значительным преимуществом при работе с персональными данными учащихся и финансовой информацией, связанной с оплатой питания.</w:t>
       </w:r>
     </w:p>
     <w:p>
@@ -4815,7 +5038,25 @@
           <w:sz w:val="28"/>
           <w:szCs w:val="28"/>
         </w:rPr>
-        <w:t>Также структура базы данных была спроектирована с учетом дальнейшего развития системы. Мы предусмотрели возможность расширения функциональности, добавления новых ролей пользователей, типов блюд, категорий меню и этапов обработки заявок на закупку продуктов. Реляционная модель PostgreSQL и поддержка сложных связей между таблицами позволяют легко адаптировать базу данных к изменяющимся требованиям без серьезных изменений архитектуры. Оптимизированные SQL-запросы и механизмы индексации обеспечивают высокую производительность при работе с отчетами и статистикой.</w:t>
+        <w:t xml:space="preserve">Также структура базы данных была спроектирована с учетом дальнейшего развития системы. Мы предусмотрели возможность расширения функциональности, добавления новых ролей пользователей, типов блюд, категорий меню и этапов обработки заявок на закупку продуктов. Реляционная модель </w:t>
+      </w:r>
+      <w:proofErr w:type="spellStart"/>
+      <w:r>
+        <w:rPr>
+          <w:rFonts w:ascii="Times New Roman" w:eastAsia="Times New Roman" w:hAnsi="Times New Roman" w:cs="Times New Roman"/>
+          <w:sz w:val="28"/>
+          <w:szCs w:val="28"/>
+        </w:rPr>
+        <w:t>PostgreSQL</w:t>
+      </w:r>
+      <w:proofErr w:type="spellEnd"/>
+      <w:r>
+        <w:rPr>
+          <w:rFonts w:ascii="Times New Roman" w:eastAsia="Times New Roman" w:hAnsi="Times New Roman" w:cs="Times New Roman"/>
+          <w:sz w:val="28"/>
+          <w:szCs w:val="28"/>
+        </w:rPr>
+        <w:t xml:space="preserve"> и поддержка сложных связей между таблицами позволяют легко адаптировать базу данных к изменяющимся требованиям без серьезных изменений архитектуры. Оптимизированные SQL-запросы и механизмы индексации обеспечивают высокую производительность при работе с отчетами и статистикой.</w:t>
       </w:r>
     </w:p>
     <w:p>
@@ -4835,7 +5076,52 @@
           <w:sz w:val="28"/>
           <w:szCs w:val="28"/>
         </w:rPr>
-        <w:t>Для работы с базой данных в рамках проекта мы используем встроенные инструменты фреймворка Django. Django предоставляет удобный ORM-механизм (Object-R</w:t>
+        <w:t xml:space="preserve">Для работы с базой данных в рамках проекта мы используем встроенные инструменты фреймворка </w:t>
+      </w:r>
+      <w:proofErr w:type="spellStart"/>
+      <w:r>
+        <w:rPr>
+          <w:rFonts w:ascii="Times New Roman" w:eastAsia="Times New Roman" w:hAnsi="Times New Roman" w:cs="Times New Roman"/>
+          <w:sz w:val="28"/>
+          <w:szCs w:val="28"/>
+        </w:rPr>
+        <w:t>Django</w:t>
+      </w:r>
+      <w:proofErr w:type="spellEnd"/>
+      <w:r>
+        <w:rPr>
+          <w:rFonts w:ascii="Times New Roman" w:eastAsia="Times New Roman" w:hAnsi="Times New Roman" w:cs="Times New Roman"/>
+          <w:sz w:val="28"/>
+          <w:szCs w:val="28"/>
+        </w:rPr>
+        <w:t xml:space="preserve">. </w:t>
+      </w:r>
+      <w:proofErr w:type="spellStart"/>
+      <w:r>
+        <w:rPr>
+          <w:rFonts w:ascii="Times New Roman" w:eastAsia="Times New Roman" w:hAnsi="Times New Roman" w:cs="Times New Roman"/>
+          <w:sz w:val="28"/>
+          <w:szCs w:val="28"/>
+        </w:rPr>
+        <w:t>Django</w:t>
+      </w:r>
+      <w:proofErr w:type="spellEnd"/>
+      <w:r>
+        <w:rPr>
+          <w:rFonts w:ascii="Times New Roman" w:eastAsia="Times New Roman" w:hAnsi="Times New Roman" w:cs="Times New Roman"/>
+          <w:sz w:val="28"/>
+          <w:szCs w:val="28"/>
+        </w:rPr>
+        <w:t xml:space="preserve"> предоставляет удобный ORM-механизм (Object-</w:t>
+      </w:r>
+      <w:proofErr w:type="spellStart"/>
+      <w:r>
+        <w:rPr>
+          <w:rFonts w:ascii="Times New Roman" w:eastAsia="Times New Roman" w:hAnsi="Times New Roman" w:cs="Times New Roman"/>
+          <w:sz w:val="28"/>
+          <w:szCs w:val="28"/>
+        </w:rPr>
+        <w:t>R</w:t>
       </w:r>
       <w:r>
         <w:rPr>
@@ -5251,7 +5537,34 @@
           <w:sz w:val="28"/>
           <w:szCs w:val="28"/>
         </w:rPr>
-        <w:t xml:space="preserve">elational Mapping), который позволяет взаимодействовать с базой </w:t>
+        <w:t>elational</w:t>
+      </w:r>
+      <w:proofErr w:type="spellEnd"/>
+      <w:r>
+        <w:rPr>
+          <w:rFonts w:ascii="Times New Roman" w:eastAsia="Times New Roman" w:hAnsi="Times New Roman" w:cs="Times New Roman"/>
+          <w:sz w:val="28"/>
+          <w:szCs w:val="28"/>
+        </w:rPr>
+        <w:t xml:space="preserve"> </w:t>
+      </w:r>
+      <w:proofErr w:type="spellStart"/>
+      <w:r>
+        <w:rPr>
+          <w:rFonts w:ascii="Times New Roman" w:eastAsia="Times New Roman" w:hAnsi="Times New Roman" w:cs="Times New Roman"/>
+          <w:sz w:val="28"/>
+          <w:szCs w:val="28"/>
+        </w:rPr>
+        <w:t>Mapping</w:t>
+      </w:r>
+      <w:proofErr w:type="spellEnd"/>
+      <w:r>
+        <w:rPr>
+          <w:rFonts w:ascii="Times New Roman" w:eastAsia="Times New Roman" w:hAnsi="Times New Roman" w:cs="Times New Roman"/>
+          <w:sz w:val="28"/>
+          <w:szCs w:val="28"/>
+        </w:rPr>
+        <w:t xml:space="preserve">), который позволяет взаимодействовать с базой </w:t>
       </w:r>
       <w:r>
         <w:rPr>
@@ -5260,8 +5573,27 @@
           <w:szCs w:val="28"/>
         </w:rPr>
         <w:lastRenderedPageBreak/>
-        <w:t xml:space="preserve">данных без написания сложных SQL-запросов, а также упрощает управление структурами таблиц с помощью системы миграций. Для администрирования данных применяется стандартная административная панель Django, обеспечивающая наглядный интерфейс для просмотра, добавления и редактирования записей. При необходимости прямого просмотра содержимого базы данных также может использоваться </w:t>
-      </w:r>
+        <w:t xml:space="preserve">данных без написания сложных SQL-запросов, а также упрощает управление структурами таблиц с помощью системы миграций. Для администрирования данных применяется стандартная административная панель </w:t>
+      </w:r>
+      <w:proofErr w:type="spellStart"/>
+      <w:r>
+        <w:rPr>
+          <w:rFonts w:ascii="Times New Roman" w:eastAsia="Times New Roman" w:hAnsi="Times New Roman" w:cs="Times New Roman"/>
+          <w:sz w:val="28"/>
+          <w:szCs w:val="28"/>
+        </w:rPr>
+        <w:t>Django</w:t>
+      </w:r>
+      <w:proofErr w:type="spellEnd"/>
+      <w:r>
+        <w:rPr>
+          <w:rFonts w:ascii="Times New Roman" w:eastAsia="Times New Roman" w:hAnsi="Times New Roman" w:cs="Times New Roman"/>
+          <w:sz w:val="28"/>
+          <w:szCs w:val="28"/>
+        </w:rPr>
+        <w:t xml:space="preserve">, обеспечивающая наглядный интерфейс для просмотра, добавления и редактирования записей. При необходимости прямого просмотра содержимого базы данных также может использоваться </w:t>
+      </w:r>
+      <w:proofErr w:type="spellStart"/>
       <w:r>
         <w:rPr>
           <w:rFonts w:ascii="Times New Roman" w:eastAsia="Times New Roman" w:hAnsi="Times New Roman" w:cs="Times New Roman"/>
@@ -5271,6 +5603,7 @@
         </w:rPr>
         <w:t>pgAdmin</w:t>
       </w:r>
+      <w:proofErr w:type="spellEnd"/>
       <w:r>
         <w:rPr>
           <w:rFonts w:ascii="Times New Roman" w:eastAsia="Times New Roman" w:hAnsi="Times New Roman" w:cs="Times New Roman"/>
@@ -5309,7 +5642,126 @@
           <w:sz w:val="28"/>
           <w:szCs w:val="28"/>
         </w:rPr>
-        <w:t>Схема структуры базы данных находится на рисунке 4.</w:t>
+        <w:t>Схема структуры базы данных находится на рисунке 4</w:t>
+      </w:r>
+      <w:r>
+        <w:rPr>
+          <w:rFonts w:ascii="Times New Roman" w:eastAsia="Times New Roman" w:hAnsi="Times New Roman" w:cs="Times New Roman"/>
+          <w:sz w:val="28"/>
+          <w:szCs w:val="28"/>
+        </w:rPr>
+        <w:t>, но её можно также посмотреть в репозитории (</w:t>
+      </w:r>
+      <w:r>
+        <w:rPr>
+          <w:rFonts w:ascii="Times New Roman" w:eastAsia="Times New Roman" w:hAnsi="Times New Roman" w:cs="Times New Roman"/>
+          <w:i/>
+          <w:iCs/>
+          <w:sz w:val="28"/>
+          <w:szCs w:val="28"/>
+          <w:lang w:val="en-US"/>
+        </w:rPr>
+        <w:t>food</w:t>
+      </w:r>
+      <w:r>
+        <w:rPr>
+          <w:rFonts w:ascii="Times New Roman" w:eastAsia="Times New Roman" w:hAnsi="Times New Roman" w:cs="Times New Roman"/>
+          <w:i/>
+          <w:iCs/>
+          <w:sz w:val="28"/>
+          <w:szCs w:val="28"/>
+        </w:rPr>
+        <w:t>_</w:t>
+      </w:r>
+      <w:r>
+        <w:rPr>
+          <w:rFonts w:ascii="Times New Roman" w:eastAsia="Times New Roman" w:hAnsi="Times New Roman" w:cs="Times New Roman"/>
+          <w:i/>
+          <w:iCs/>
+          <w:sz w:val="28"/>
+          <w:szCs w:val="28"/>
+          <w:lang w:val="en-US"/>
+        </w:rPr>
+        <w:t>control</w:t>
+      </w:r>
+      <w:r>
+        <w:rPr>
+          <w:rFonts w:ascii="Times New Roman" w:eastAsia="Times New Roman" w:hAnsi="Times New Roman" w:cs="Times New Roman"/>
+          <w:i/>
+          <w:iCs/>
+          <w:sz w:val="28"/>
+          <w:szCs w:val="28"/>
+        </w:rPr>
+        <w:t>/</w:t>
+      </w:r>
+      <w:r>
+        <w:rPr>
+          <w:rFonts w:ascii="Times New Roman" w:eastAsia="Times New Roman" w:hAnsi="Times New Roman" w:cs="Times New Roman"/>
+          <w:i/>
+          <w:iCs/>
+          <w:sz w:val="28"/>
+          <w:szCs w:val="28"/>
+          <w:lang w:val="en-US"/>
+        </w:rPr>
+        <w:t>docs</w:t>
+      </w:r>
+      <w:r>
+        <w:rPr>
+          <w:rFonts w:ascii="Times New Roman" w:eastAsia="Times New Roman" w:hAnsi="Times New Roman" w:cs="Times New Roman"/>
+          <w:i/>
+          <w:iCs/>
+          <w:sz w:val="28"/>
+          <w:szCs w:val="28"/>
+        </w:rPr>
+        <w:t>/</w:t>
+      </w:r>
+      <w:r>
+        <w:rPr>
+          <w:rFonts w:ascii="Times New Roman" w:eastAsia="Times New Roman" w:hAnsi="Times New Roman" w:cs="Times New Roman"/>
+          <w:i/>
+          <w:iCs/>
+          <w:sz w:val="28"/>
+          <w:szCs w:val="28"/>
+          <w:lang w:val="en-US"/>
+        </w:rPr>
+        <w:t>db</w:t>
+      </w:r>
+      <w:r>
+        <w:rPr>
+          <w:rFonts w:ascii="Times New Roman" w:eastAsia="Times New Roman" w:hAnsi="Times New Roman" w:cs="Times New Roman"/>
+          <w:i/>
+          <w:iCs/>
+          <w:sz w:val="28"/>
+          <w:szCs w:val="28"/>
+        </w:rPr>
+        <w:t>.</w:t>
+      </w:r>
+      <w:r>
+        <w:rPr>
+          <w:rFonts w:ascii="Times New Roman" w:eastAsia="Times New Roman" w:hAnsi="Times New Roman" w:cs="Times New Roman"/>
+          <w:i/>
+          <w:iCs/>
+          <w:sz w:val="28"/>
+          <w:szCs w:val="28"/>
+          <w:lang w:val="en-US"/>
+        </w:rPr>
+        <w:t>svg</w:t>
+      </w:r>
+      <w:r>
+        <w:rPr>
+          <w:rFonts w:ascii="Times New Roman" w:eastAsia="Times New Roman" w:hAnsi="Times New Roman" w:cs="Times New Roman"/>
+          <w:sz w:val="28"/>
+          <w:szCs w:val="28"/>
+        </w:rPr>
+        <w:t>)</w:t>
+      </w:r>
+      <w:r>
+        <w:rPr>
+          <w:rFonts w:ascii="Times New Roman" w:eastAsia="Times New Roman" w:hAnsi="Times New Roman" w:cs="Times New Roman"/>
+          <w:sz w:val="28"/>
+          <w:szCs w:val="28"/>
+        </w:rPr>
+        <w:t>.</w:t>
       </w:r>
     </w:p>
     <w:p>

</xml_diff>